<commit_message>
Fix Word document font compatibility
</commit_message>
<xml_diff>
--- a/docs/FFRTP-128固定帧可靠传输协议及Python双向APP设计说明_V1.0.docx
+++ b/docs/FFRTP-128固定帧可靠传输协议及Python双向APP设计说明_V1.0.docx
@@ -8,6 +8,9 @@
         <w:jc w:val="center"/>
       </w:pPr>
       <w:r>
+        <w:rPr>
+          <w:rFonts w:ascii="Arial" w:hAnsi="Arial" w:cs="Arial" w:eastAsia="Microsoft YaHei"/>
+        </w:rPr>
         <w:t>FFRTP-128固定帧可靠传输协议及Python双向APP设计说明</w:t>
       </w:r>
     </w:p>
@@ -17,6 +20,7 @@
       </w:pPr>
       <w:r>
         <w:rPr>
+          <w:rFonts w:ascii="Arial" w:hAnsi="Arial" w:cs="Arial" w:eastAsia="Microsoft YaHei"/>
           <w:b/>
           <w:sz w:val="22"/>
         </w:rPr>
@@ -27,22 +31,30 @@
     <w:p>
       <w:r>
         <w:rPr>
+          <w:rFonts w:ascii="Arial" w:hAnsi="Arial" w:cs="Arial" w:eastAsia="Microsoft YaHei"/>
           <w:b/>
         </w:rPr>
         <w:t xml:space="preserve">文档目的  </w:t>
       </w:r>
       <w:r>
+        <w:rPr>
+          <w:rFonts w:ascii="Arial" w:hAnsi="Arial" w:cs="Arial" w:eastAsia="Microsoft YaHei"/>
+        </w:rPr>
         <w:t>规定FFRTP-128固定帧可靠传输协议，并说明上位机Python APP和下位机程序的实现流程。FFRTP表示Fixed-Frame Reliable Transfer Protocol，128表示每个SOH数据帧承载128字节文件数据。协议面向UART或RS485链路，采用停等传输、32位连续序号、分包CRC16、重复包丢弃和EOT确认。</w:t>
       </w:r>
     </w:p>
     <w:p>
       <w:r>
         <w:rPr>
+          <w:rFonts w:ascii="Arial" w:hAnsi="Arial" w:cs="Arial" w:eastAsia="Microsoft YaHei"/>
           <w:b/>
         </w:rPr>
         <w:t xml:space="preserve">核心结论  </w:t>
       </w:r>
       <w:r>
+        <w:rPr>
+          <w:rFonts w:ascii="Arial" w:hAnsi="Arial" w:cs="Arial" w:eastAsia="Microsoft YaHei"/>
+        </w:rPr>
         <w:t>FFRTP-128不传输文件名和独立文件长度，文件长度必须是128字节的整数倍。SOH、EOT和CAN均使用135字节完整帧；EOT序号等于接收端的下一个期望序号。任意一端都可以发送或接收，但一次传输必须一端发送、另一端接收。</w:t>
       </w:r>
     </w:p>
@@ -51,16 +63,25 @@
         <w:pStyle w:val="Heading1"/>
       </w:pPr>
       <w:r>
+        <w:rPr>
+          <w:rFonts w:ascii="Arial" w:hAnsi="Arial" w:cs="Arial" w:eastAsia="Microsoft YaHei"/>
+        </w:rPr>
         <w:t>1 协议范围</w:t>
       </w:r>
     </w:p>
     <w:p>
       <w:r>
+        <w:rPr>
+          <w:rFonts w:ascii="Arial" w:hAnsi="Arial" w:cs="Arial" w:eastAsia="Microsoft YaHei"/>
+        </w:rPr>
         <w:t>协议标识为FFRTP-128，英文展开为Fixed-Frame Reliable Transfer Protocol，版本为V1.0；数字128表示每个SOH帧承载128字节文件数据。</w:t>
       </w:r>
     </w:p>
     <w:p>
       <w:r>
+        <w:rPr>
+          <w:rFonts w:ascii="Arial" w:hAnsi="Arial" w:cs="Arial" w:eastAsia="Microsoft YaHei"/>
+        </w:rPr>
         <w:t>FFRTP-128适用于单文件二进制传输，可用于固件、参数文件、采集数据或其他固定长度数据。链路应保证字节有序到达。协议仅校验每个135字节帧，不计算整文件CRC；Flash写入后的校验、固件合法性和版本检查由应用层负责。</w:t>
       </w:r>
     </w:p>
@@ -69,6 +90,9 @@
         <w:pStyle w:val="Heading1"/>
       </w:pPr>
       <w:r>
+        <w:rPr>
+          <w:rFonts w:ascii="Arial" w:hAnsi="Arial" w:cs="Arial" w:eastAsia="Microsoft YaHei"/>
+        </w:rPr>
         <w:t>2 角色与双向工作方式</w:t>
       </w:r>
     </w:p>
@@ -115,6 +139,7 @@
             </w:pPr>
             <w:r>
               <w:rPr>
+                <w:rFonts w:ascii="Arial" w:hAnsi="Arial" w:cs="Arial" w:eastAsia="Microsoft YaHei"/>
                 <w:b/>
                 <w:color w:val="FFFFFF"/>
               </w:rPr>
@@ -148,6 +173,7 @@
             </w:pPr>
             <w:r>
               <w:rPr>
+                <w:rFonts w:ascii="Arial" w:hAnsi="Arial" w:cs="Arial" w:eastAsia="Microsoft YaHei"/>
                 <w:b/>
                 <w:color w:val="FFFFFF"/>
               </w:rPr>
@@ -181,6 +207,7 @@
             </w:pPr>
             <w:r>
               <w:rPr>
+                <w:rFonts w:ascii="Arial" w:hAnsi="Arial" w:cs="Arial" w:eastAsia="Microsoft YaHei"/>
                 <w:b/>
                 <w:color w:val="FFFFFF"/>
               </w:rPr>
@@ -217,6 +244,9 @@
               <w:jc w:val="center"/>
             </w:pPr>
             <w:r>
+              <w:rPr>
+                <w:rFonts w:ascii="Arial" w:hAnsi="Arial" w:cs="Arial" w:eastAsia="Microsoft YaHei"/>
+              </w:rPr>
               <w:t>上位机</w:t>
             </w:r>
           </w:p>
@@ -245,6 +275,9 @@
               <w:jc w:val="center"/>
             </w:pPr>
             <w:r>
+              <w:rPr>
+                <w:rFonts w:ascii="Arial" w:hAnsi="Arial" w:cs="Arial" w:eastAsia="Microsoft YaHei"/>
+              </w:rPr>
               <w:t>发送方</w:t>
             </w:r>
           </w:p>
@@ -273,6 +306,9 @@
               <w:jc w:val="left"/>
             </w:pPr>
             <w:r>
+              <w:rPr>
+                <w:rFonts w:ascii="Arial" w:hAnsi="Arial" w:cs="Arial" w:eastAsia="Microsoft YaHei"/>
+              </w:rPr>
               <w:t>等待字符C，顺序发送SOH数据帧，最后发送EOT帧</w:t>
             </w:r>
           </w:p>
@@ -307,6 +343,9 @@
               <w:jc w:val="center"/>
             </w:pPr>
             <w:r>
+              <w:rPr>
+                <w:rFonts w:ascii="Arial" w:hAnsi="Arial" w:cs="Arial" w:eastAsia="Microsoft YaHei"/>
+              </w:rPr>
               <w:t>上位机</w:t>
             </w:r>
           </w:p>
@@ -336,6 +375,9 @@
               <w:jc w:val="center"/>
             </w:pPr>
             <w:r>
+              <w:rPr>
+                <w:rFonts w:ascii="Arial" w:hAnsi="Arial" w:cs="Arial" w:eastAsia="Microsoft YaHei"/>
+              </w:rPr>
               <w:t>接收方</w:t>
             </w:r>
           </w:p>
@@ -365,6 +407,9 @@
               <w:jc w:val="left"/>
             </w:pPr>
             <w:r>
+              <w:rPr>
+                <w:rFonts w:ascii="Arial" w:hAnsi="Arial" w:cs="Arial" w:eastAsia="Microsoft YaHei"/>
+              </w:rPr>
               <w:t>周期发送字符C，接收并校验数据帧，回复ACK或NAK</w:t>
             </w:r>
           </w:p>
@@ -398,6 +443,9 @@
               <w:jc w:val="center"/>
             </w:pPr>
             <w:r>
+              <w:rPr>
+                <w:rFonts w:ascii="Arial" w:hAnsi="Arial" w:cs="Arial" w:eastAsia="Microsoft YaHei"/>
+              </w:rPr>
               <w:t>下位机</w:t>
             </w:r>
           </w:p>
@@ -426,6 +474,9 @@
               <w:jc w:val="center"/>
             </w:pPr>
             <w:r>
+              <w:rPr>
+                <w:rFonts w:ascii="Arial" w:hAnsi="Arial" w:cs="Arial" w:eastAsia="Microsoft YaHei"/>
+              </w:rPr>
               <w:t>发送方</w:t>
             </w:r>
           </w:p>
@@ -454,6 +505,9 @@
               <w:jc w:val="left"/>
             </w:pPr>
             <w:r>
+              <w:rPr>
+                <w:rFonts w:ascii="Arial" w:hAnsi="Arial" w:cs="Arial" w:eastAsia="Microsoft YaHei"/>
+              </w:rPr>
               <w:t>与上位机发送方执行相同的协议状态机</w:t>
             </w:r>
           </w:p>
@@ -488,6 +542,9 @@
               <w:jc w:val="center"/>
             </w:pPr>
             <w:r>
+              <w:rPr>
+                <w:rFonts w:ascii="Arial" w:hAnsi="Arial" w:cs="Arial" w:eastAsia="Microsoft YaHei"/>
+              </w:rPr>
               <w:t>下位机</w:t>
             </w:r>
           </w:p>
@@ -517,6 +574,9 @@
               <w:jc w:val="center"/>
             </w:pPr>
             <w:r>
+              <w:rPr>
+                <w:rFonts w:ascii="Arial" w:hAnsi="Arial" w:cs="Arial" w:eastAsia="Microsoft YaHei"/>
+              </w:rPr>
               <w:t>接收方</w:t>
             </w:r>
           </w:p>
@@ -546,6 +606,9 @@
               <w:jc w:val="left"/>
             </w:pPr>
             <w:r>
+              <w:rPr>
+                <w:rFonts w:ascii="Arial" w:hAnsi="Arial" w:cs="Arial" w:eastAsia="Microsoft YaHei"/>
+              </w:rPr>
               <w:t>与上位机接收方执行相同的协议状态机</w:t>
             </w:r>
           </w:p>
@@ -559,6 +622,9 @@
     </w:p>
     <w:p>
       <w:r>
+        <w:rPr>
+          <w:rFonts w:ascii="Arial" w:hAnsi="Arial" w:cs="Arial" w:eastAsia="Microsoft YaHei"/>
+        </w:rPr>
         <w:t>主从仅描述设备关系，不限制数据方向。协议真正使用的是发送方和接收方两个临时角色。若两端同时选择发送，两端都会等待C；若两端同时选择接收，两端都会发送C，均不能建立有效传输。</w:t>
       </w:r>
     </w:p>
@@ -567,6 +633,9 @@
         <w:pStyle w:val="Heading1"/>
       </w:pPr>
       <w:r>
+        <w:rPr>
+          <w:rFonts w:ascii="Arial" w:hAnsi="Arial" w:cs="Arial" w:eastAsia="Microsoft YaHei"/>
+        </w:rPr>
         <w:t>3 串口与超时参数</w:t>
       </w:r>
     </w:p>
@@ -612,6 +681,7 @@
             </w:pPr>
             <w:r>
               <w:rPr>
+                <w:rFonts w:ascii="Arial" w:hAnsi="Arial" w:cs="Arial" w:eastAsia="Microsoft YaHei"/>
                 <w:b/>
                 <w:color w:val="FFFFFF"/>
               </w:rPr>
@@ -645,6 +715,7 @@
             </w:pPr>
             <w:r>
               <w:rPr>
+                <w:rFonts w:ascii="Arial" w:hAnsi="Arial" w:cs="Arial" w:eastAsia="Microsoft YaHei"/>
                 <w:b/>
                 <w:color w:val="FFFFFF"/>
               </w:rPr>
@@ -681,6 +752,9 @@
               <w:jc w:val="center"/>
             </w:pPr>
             <w:r>
+              <w:rPr>
+                <w:rFonts w:ascii="Arial" w:hAnsi="Arial" w:cs="Arial" w:eastAsia="Microsoft YaHei"/>
+              </w:rPr>
               <w:t>串口格式</w:t>
             </w:r>
           </w:p>
@@ -709,6 +783,9 @@
               <w:jc w:val="center"/>
             </w:pPr>
             <w:r>
+              <w:rPr>
+                <w:rFonts w:ascii="Arial" w:hAnsi="Arial" w:cs="Arial" w:eastAsia="Microsoft YaHei"/>
+              </w:rPr>
               <w:t>8个数据位，无校验，1个停止位，即8N1</w:t>
             </w:r>
           </w:p>
@@ -743,6 +820,9 @@
               <w:jc w:val="center"/>
             </w:pPr>
             <w:r>
+              <w:rPr>
+                <w:rFonts w:ascii="Arial" w:hAnsi="Arial" w:cs="Arial" w:eastAsia="Microsoft YaHei"/>
+              </w:rPr>
               <w:t>波特率</w:t>
             </w:r>
           </w:p>
@@ -772,6 +852,9 @@
               <w:jc w:val="center"/>
             </w:pPr>
             <w:r>
+              <w:rPr>
+                <w:rFonts w:ascii="Arial" w:hAnsi="Arial" w:cs="Arial" w:eastAsia="Microsoft YaHei"/>
+              </w:rPr>
               <w:t>由双方预先配置并保持一致，APP默认115200</w:t>
             </w:r>
           </w:p>
@@ -805,6 +888,9 @@
               <w:jc w:val="center"/>
             </w:pPr>
             <w:r>
+              <w:rPr>
+                <w:rFonts w:ascii="Arial" w:hAnsi="Arial" w:cs="Arial" w:eastAsia="Microsoft YaHei"/>
+              </w:rPr>
               <w:t>控制应答</w:t>
             </w:r>
           </w:p>
@@ -833,6 +919,9 @@
               <w:jc w:val="center"/>
             </w:pPr>
             <w:r>
+              <w:rPr>
+                <w:rFonts w:ascii="Arial" w:hAnsi="Arial" w:cs="Arial" w:eastAsia="Microsoft YaHei"/>
+              </w:rPr>
               <w:t>接收方发送单字节C、ACK或NAK</w:t>
             </w:r>
           </w:p>
@@ -867,6 +956,9 @@
               <w:jc w:val="center"/>
             </w:pPr>
             <w:r>
+              <w:rPr>
+                <w:rFonts w:ascii="Arial" w:hAnsi="Arial" w:cs="Arial" w:eastAsia="Microsoft YaHei"/>
+              </w:rPr>
               <w:t>发送帧</w:t>
             </w:r>
           </w:p>
@@ -896,6 +988,9 @@
               <w:jc w:val="center"/>
             </w:pPr>
             <w:r>
+              <w:rPr>
+                <w:rFonts w:ascii="Arial" w:hAnsi="Arial" w:cs="Arial" w:eastAsia="Microsoft YaHei"/>
+              </w:rPr>
               <w:t>发送方发出的SOH、EOT和CAN均为135字节</w:t>
             </w:r>
           </w:p>
@@ -929,6 +1024,9 @@
               <w:jc w:val="center"/>
             </w:pPr>
             <w:r>
+              <w:rPr>
+                <w:rFonts w:ascii="Arial" w:hAnsi="Arial" w:cs="Arial" w:eastAsia="Microsoft YaHei"/>
+              </w:rPr>
               <w:t>单次等待</w:t>
             </w:r>
           </w:p>
@@ -957,6 +1055,9 @@
               <w:jc w:val="center"/>
             </w:pPr>
             <w:r>
+              <w:rPr>
+                <w:rFonts w:ascii="Arial" w:hAnsi="Arial" w:cs="Arial" w:eastAsia="Microsoft YaHei"/>
+              </w:rPr>
               <w:t>1秒</w:t>
             </w:r>
           </w:p>
@@ -991,6 +1092,9 @@
               <w:jc w:val="center"/>
             </w:pPr>
             <w:r>
+              <w:rPr>
+                <w:rFonts w:ascii="Arial" w:hAnsi="Arial" w:cs="Arial" w:eastAsia="Microsoft YaHei"/>
+              </w:rPr>
               <w:t>最大重试</w:t>
             </w:r>
           </w:p>
@@ -1020,6 +1124,9 @@
               <w:jc w:val="center"/>
             </w:pPr>
             <w:r>
+              <w:rPr>
+                <w:rFonts w:ascii="Arial" w:hAnsi="Arial" w:cs="Arial" w:eastAsia="Microsoft YaHei"/>
+              </w:rPr>
               <w:t>首次操作之后最多重试60次，即最多尝试61次</w:t>
             </w:r>
           </w:p>
@@ -1053,6 +1160,9 @@
               <w:jc w:val="center"/>
             </w:pPr>
             <w:r>
+              <w:rPr>
+                <w:rFonts w:ascii="Arial" w:hAnsi="Arial" w:cs="Arial" w:eastAsia="Microsoft YaHei"/>
+              </w:rPr>
               <w:t>计数复位</w:t>
             </w:r>
           </w:p>
@@ -1081,6 +1191,9 @@
               <w:jc w:val="center"/>
             </w:pPr>
             <w:r>
+              <w:rPr>
+                <w:rFonts w:ascii="Arial" w:hAnsi="Arial" w:cs="Arial" w:eastAsia="Microsoft YaHei"/>
+              </w:rPr>
               <w:t>一帧成功后，该帧的重试计数清零</w:t>
             </w:r>
           </w:p>
@@ -1097,6 +1210,9 @@
         <w:pStyle w:val="Heading1"/>
       </w:pPr>
       <w:r>
+        <w:rPr>
+          <w:rFonts w:ascii="Arial" w:hAnsi="Arial" w:cs="Arial" w:eastAsia="Microsoft YaHei"/>
+        </w:rPr>
         <w:t>4 控制值</w:t>
       </w:r>
     </w:p>
@@ -1144,6 +1260,7 @@
             </w:pPr>
             <w:r>
               <w:rPr>
+                <w:rFonts w:ascii="Arial" w:hAnsi="Arial" w:cs="Arial" w:eastAsia="Microsoft YaHei"/>
                 <w:b/>
                 <w:color w:val="FFFFFF"/>
               </w:rPr>
@@ -1177,6 +1294,7 @@
             </w:pPr>
             <w:r>
               <w:rPr>
+                <w:rFonts w:ascii="Arial" w:hAnsi="Arial" w:cs="Arial" w:eastAsia="Microsoft YaHei"/>
                 <w:b/>
                 <w:color w:val="FFFFFF"/>
               </w:rPr>
@@ -1210,6 +1328,7 @@
             </w:pPr>
             <w:r>
               <w:rPr>
+                <w:rFonts w:ascii="Arial" w:hAnsi="Arial" w:cs="Arial" w:eastAsia="Microsoft YaHei"/>
                 <w:b/>
                 <w:color w:val="FFFFFF"/>
               </w:rPr>
@@ -1243,6 +1362,7 @@
             </w:pPr>
             <w:r>
               <w:rPr>
+                <w:rFonts w:ascii="Arial" w:hAnsi="Arial" w:cs="Arial" w:eastAsia="Microsoft YaHei"/>
                 <w:b/>
                 <w:color w:val="FFFFFF"/>
               </w:rPr>
@@ -1279,6 +1399,9 @@
               <w:jc w:val="center"/>
             </w:pPr>
             <w:r>
+              <w:rPr>
+                <w:rFonts w:ascii="Arial" w:hAnsi="Arial" w:cs="Arial" w:eastAsia="Microsoft YaHei"/>
+              </w:rPr>
               <w:t>SOH</w:t>
             </w:r>
           </w:p>
@@ -1307,6 +1430,9 @@
               <w:jc w:val="center"/>
             </w:pPr>
             <w:r>
+              <w:rPr>
+                <w:rFonts w:ascii="Arial" w:hAnsi="Arial" w:cs="Arial" w:eastAsia="Microsoft YaHei"/>
+              </w:rPr>
               <w:t>0x01</w:t>
             </w:r>
           </w:p>
@@ -1335,6 +1461,9 @@
               <w:jc w:val="left"/>
             </w:pPr>
             <w:r>
+              <w:rPr>
+                <w:rFonts w:ascii="Arial" w:hAnsi="Arial" w:cs="Arial" w:eastAsia="Microsoft YaHei"/>
+              </w:rPr>
               <w:t>发送方到接收方</w:t>
             </w:r>
           </w:p>
@@ -1363,6 +1492,9 @@
               <w:jc w:val="left"/>
             </w:pPr>
             <w:r>
+              <w:rPr>
+                <w:rFonts w:ascii="Arial" w:hAnsi="Arial" w:cs="Arial" w:eastAsia="Microsoft YaHei"/>
+              </w:rPr>
               <w:t>128字节数据帧</w:t>
             </w:r>
           </w:p>
@@ -1397,6 +1529,9 @@
               <w:jc w:val="center"/>
             </w:pPr>
             <w:r>
+              <w:rPr>
+                <w:rFonts w:ascii="Arial" w:hAnsi="Arial" w:cs="Arial" w:eastAsia="Microsoft YaHei"/>
+              </w:rPr>
               <w:t>EOT</w:t>
             </w:r>
           </w:p>
@@ -1426,6 +1561,9 @@
               <w:jc w:val="center"/>
             </w:pPr>
             <w:r>
+              <w:rPr>
+                <w:rFonts w:ascii="Arial" w:hAnsi="Arial" w:cs="Arial" w:eastAsia="Microsoft YaHei"/>
+              </w:rPr>
               <w:t>0x04</w:t>
             </w:r>
           </w:p>
@@ -1455,6 +1593,9 @@
               <w:jc w:val="left"/>
             </w:pPr>
             <w:r>
+              <w:rPr>
+                <w:rFonts w:ascii="Arial" w:hAnsi="Arial" w:cs="Arial" w:eastAsia="Microsoft YaHei"/>
+              </w:rPr>
               <w:t>发送方到接收方</w:t>
             </w:r>
           </w:p>
@@ -1484,6 +1625,9 @@
               <w:jc w:val="left"/>
             </w:pPr>
             <w:r>
+              <w:rPr>
+                <w:rFonts w:ascii="Arial" w:hAnsi="Arial" w:cs="Arial" w:eastAsia="Microsoft YaHei"/>
+              </w:rPr>
               <w:t>传输结束完整帧</w:t>
             </w:r>
           </w:p>
@@ -1517,6 +1661,9 @@
               <w:jc w:val="center"/>
             </w:pPr>
             <w:r>
+              <w:rPr>
+                <w:rFonts w:ascii="Arial" w:hAnsi="Arial" w:cs="Arial" w:eastAsia="Microsoft YaHei"/>
+              </w:rPr>
               <w:t>CAN</w:t>
             </w:r>
           </w:p>
@@ -1545,6 +1692,9 @@
               <w:jc w:val="center"/>
             </w:pPr>
             <w:r>
+              <w:rPr>
+                <w:rFonts w:ascii="Arial" w:hAnsi="Arial" w:cs="Arial" w:eastAsia="Microsoft YaHei"/>
+              </w:rPr>
               <w:t>0x18</w:t>
             </w:r>
           </w:p>
@@ -1573,6 +1723,9 @@
               <w:jc w:val="left"/>
             </w:pPr>
             <w:r>
+              <w:rPr>
+                <w:rFonts w:ascii="Arial" w:hAnsi="Arial" w:cs="Arial" w:eastAsia="Microsoft YaHei"/>
+              </w:rPr>
               <w:t>发送方到接收方</w:t>
             </w:r>
           </w:p>
@@ -1601,6 +1754,9 @@
               <w:jc w:val="left"/>
             </w:pPr>
             <w:r>
+              <w:rPr>
+                <w:rFonts w:ascii="Arial" w:hAnsi="Arial" w:cs="Arial" w:eastAsia="Microsoft YaHei"/>
+              </w:rPr>
               <w:t>发送方取消传输的完整帧</w:t>
             </w:r>
           </w:p>
@@ -1635,6 +1791,9 @@
               <w:jc w:val="center"/>
             </w:pPr>
             <w:r>
+              <w:rPr>
+                <w:rFonts w:ascii="Arial" w:hAnsi="Arial" w:cs="Arial" w:eastAsia="Microsoft YaHei"/>
+              </w:rPr>
               <w:t>C</w:t>
             </w:r>
           </w:p>
@@ -1664,6 +1823,9 @@
               <w:jc w:val="center"/>
             </w:pPr>
             <w:r>
+              <w:rPr>
+                <w:rFonts w:ascii="Arial" w:hAnsi="Arial" w:cs="Arial" w:eastAsia="Microsoft YaHei"/>
+              </w:rPr>
               <w:t>0x43</w:t>
             </w:r>
           </w:p>
@@ -1693,6 +1855,9 @@
               <w:jc w:val="left"/>
             </w:pPr>
             <w:r>
+              <w:rPr>
+                <w:rFonts w:ascii="Arial" w:hAnsi="Arial" w:cs="Arial" w:eastAsia="Microsoft YaHei"/>
+              </w:rPr>
               <w:t>接收方到发送方</w:t>
             </w:r>
           </w:p>
@@ -1722,6 +1887,9 @@
               <w:jc w:val="left"/>
             </w:pPr>
             <w:r>
+              <w:rPr>
+                <w:rFonts w:ascii="Arial" w:hAnsi="Arial" w:cs="Arial" w:eastAsia="Microsoft YaHei"/>
+              </w:rPr>
               <w:t>请求发送端开始CRC16模式传输</w:t>
             </w:r>
           </w:p>
@@ -1755,6 +1923,9 @@
               <w:jc w:val="center"/>
             </w:pPr>
             <w:r>
+              <w:rPr>
+                <w:rFonts w:ascii="Arial" w:hAnsi="Arial" w:cs="Arial" w:eastAsia="Microsoft YaHei"/>
+              </w:rPr>
               <w:t>ACK</w:t>
             </w:r>
           </w:p>
@@ -1783,6 +1954,9 @@
               <w:jc w:val="center"/>
             </w:pPr>
             <w:r>
+              <w:rPr>
+                <w:rFonts w:ascii="Arial" w:hAnsi="Arial" w:cs="Arial" w:eastAsia="Microsoft YaHei"/>
+              </w:rPr>
               <w:t>0x06</w:t>
             </w:r>
           </w:p>
@@ -1811,6 +1985,9 @@
               <w:jc w:val="left"/>
             </w:pPr>
             <w:r>
+              <w:rPr>
+                <w:rFonts w:ascii="Arial" w:hAnsi="Arial" w:cs="Arial" w:eastAsia="Microsoft YaHei"/>
+              </w:rPr>
               <w:t>接收方到发送方</w:t>
             </w:r>
           </w:p>
@@ -1839,6 +2016,9 @@
               <w:jc w:val="left"/>
             </w:pPr>
             <w:r>
+              <w:rPr>
+                <w:rFonts w:ascii="Arial" w:hAnsi="Arial" w:cs="Arial" w:eastAsia="Microsoft YaHei"/>
+              </w:rPr>
               <w:t>本次数据帧或EOT接收成功</w:t>
             </w:r>
           </w:p>
@@ -1873,6 +2053,9 @@
               <w:jc w:val="center"/>
             </w:pPr>
             <w:r>
+              <w:rPr>
+                <w:rFonts w:ascii="Arial" w:hAnsi="Arial" w:cs="Arial" w:eastAsia="Microsoft YaHei"/>
+              </w:rPr>
               <w:t>NAK</w:t>
             </w:r>
           </w:p>
@@ -1902,6 +2085,9 @@
               <w:jc w:val="center"/>
             </w:pPr>
             <w:r>
+              <w:rPr>
+                <w:rFonts w:ascii="Arial" w:hAnsi="Arial" w:cs="Arial" w:eastAsia="Microsoft YaHei"/>
+              </w:rPr>
               <w:t>0x15</w:t>
             </w:r>
           </w:p>
@@ -1931,6 +2117,9 @@
               <w:jc w:val="left"/>
             </w:pPr>
             <w:r>
+              <w:rPr>
+                <w:rFonts w:ascii="Arial" w:hAnsi="Arial" w:cs="Arial" w:eastAsia="Microsoft YaHei"/>
+              </w:rPr>
               <w:t>接收方到发送方</w:t>
             </w:r>
           </w:p>
@@ -1960,6 +2149,9 @@
               <w:jc w:val="left"/>
             </w:pPr>
             <w:r>
+              <w:rPr>
+                <w:rFonts w:ascii="Arial" w:hAnsi="Arial" w:cs="Arial" w:eastAsia="Microsoft YaHei"/>
+              </w:rPr>
               <w:t>校验、序号或接收过程失败，要求重发</w:t>
             </w:r>
           </w:p>
@@ -1976,6 +2168,9 @@
         <w:pStyle w:val="Heading1"/>
       </w:pPr>
       <w:r>
+        <w:rPr>
+          <w:rFonts w:ascii="Arial" w:hAnsi="Arial" w:cs="Arial" w:eastAsia="Microsoft YaHei"/>
+        </w:rPr>
         <w:t>5 固定帧格式</w:t>
       </w:r>
     </w:p>
@@ -2023,6 +2218,7 @@
             </w:pPr>
             <w:r>
               <w:rPr>
+                <w:rFonts w:ascii="Arial" w:hAnsi="Arial" w:cs="Arial" w:eastAsia="Microsoft YaHei"/>
                 <w:b/>
                 <w:color w:val="FFFFFF"/>
               </w:rPr>
@@ -2056,6 +2252,7 @@
             </w:pPr>
             <w:r>
               <w:rPr>
+                <w:rFonts w:ascii="Arial" w:hAnsi="Arial" w:cs="Arial" w:eastAsia="Microsoft YaHei"/>
                 <w:b/>
                 <w:color w:val="FFFFFF"/>
               </w:rPr>
@@ -2089,6 +2286,7 @@
             </w:pPr>
             <w:r>
               <w:rPr>
+                <w:rFonts w:ascii="Arial" w:hAnsi="Arial" w:cs="Arial" w:eastAsia="Microsoft YaHei"/>
                 <w:b/>
                 <w:color w:val="FFFFFF"/>
               </w:rPr>
@@ -2122,6 +2320,7 @@
             </w:pPr>
             <w:r>
               <w:rPr>
+                <w:rFonts w:ascii="Arial" w:hAnsi="Arial" w:cs="Arial" w:eastAsia="Microsoft YaHei"/>
                 <w:b/>
                 <w:color w:val="FFFFFF"/>
               </w:rPr>
@@ -2158,6 +2357,9 @@
               <w:jc w:val="center"/>
             </w:pPr>
             <w:r>
+              <w:rPr>
+                <w:rFonts w:ascii="Arial" w:hAnsi="Arial" w:cs="Arial" w:eastAsia="Microsoft YaHei"/>
+              </w:rPr>
               <w:t>0</w:t>
             </w:r>
           </w:p>
@@ -2186,6 +2388,9 @@
               <w:jc w:val="center"/>
             </w:pPr>
             <w:r>
+              <w:rPr>
+                <w:rFonts w:ascii="Arial" w:hAnsi="Arial" w:cs="Arial" w:eastAsia="Microsoft YaHei"/>
+              </w:rPr>
               <w:t>1</w:t>
             </w:r>
           </w:p>
@@ -2214,6 +2419,9 @@
               <w:jc w:val="left"/>
             </w:pPr>
             <w:r>
+              <w:rPr>
+                <w:rFonts w:ascii="Arial" w:hAnsi="Arial" w:cs="Arial" w:eastAsia="Microsoft YaHei"/>
+              </w:rPr>
               <w:t>帧类型</w:t>
             </w:r>
           </w:p>
@@ -2242,6 +2450,9 @@
               <w:jc w:val="left"/>
             </w:pPr>
             <w:r>
+              <w:rPr>
+                <w:rFonts w:ascii="Arial" w:hAnsi="Arial" w:cs="Arial" w:eastAsia="Microsoft YaHei"/>
+              </w:rPr>
               <w:t>SOH 0x01、EOT 0x04或CAN 0x18</w:t>
             </w:r>
           </w:p>
@@ -2276,6 +2487,9 @@
               <w:jc w:val="center"/>
             </w:pPr>
             <w:r>
+              <w:rPr>
+                <w:rFonts w:ascii="Arial" w:hAnsi="Arial" w:cs="Arial" w:eastAsia="Microsoft YaHei"/>
+              </w:rPr>
               <w:t>1至4</w:t>
             </w:r>
           </w:p>
@@ -2305,6 +2519,9 @@
               <w:jc w:val="center"/>
             </w:pPr>
             <w:r>
+              <w:rPr>
+                <w:rFonts w:ascii="Arial" w:hAnsi="Arial" w:cs="Arial" w:eastAsia="Microsoft YaHei"/>
+              </w:rPr>
               <w:t>4</w:t>
             </w:r>
           </w:p>
@@ -2334,6 +2551,9 @@
               <w:jc w:val="left"/>
             </w:pPr>
             <w:r>
+              <w:rPr>
+                <w:rFonts w:ascii="Arial" w:hAnsi="Arial" w:cs="Arial" w:eastAsia="Microsoft YaHei"/>
+              </w:rPr>
               <w:t>包序号</w:t>
             </w:r>
           </w:p>
@@ -2363,6 +2583,9 @@
               <w:jc w:val="left"/>
             </w:pPr>
             <w:r>
+              <w:rPr>
+                <w:rFonts w:ascii="Arial" w:hAnsi="Arial" w:cs="Arial" w:eastAsia="Microsoft YaHei"/>
+              </w:rPr>
               <w:t>uint32_t，小端；从0开始，不循环自加</w:t>
             </w:r>
           </w:p>
@@ -2396,6 +2619,9 @@
               <w:jc w:val="center"/>
             </w:pPr>
             <w:r>
+              <w:rPr>
+                <w:rFonts w:ascii="Arial" w:hAnsi="Arial" w:cs="Arial" w:eastAsia="Microsoft YaHei"/>
+              </w:rPr>
               <w:t>5至132</w:t>
             </w:r>
           </w:p>
@@ -2424,6 +2650,9 @@
               <w:jc w:val="center"/>
             </w:pPr>
             <w:r>
+              <w:rPr>
+                <w:rFonts w:ascii="Arial" w:hAnsi="Arial" w:cs="Arial" w:eastAsia="Microsoft YaHei"/>
+              </w:rPr>
               <w:t>128</w:t>
             </w:r>
           </w:p>
@@ -2452,6 +2681,9 @@
               <w:jc w:val="left"/>
             </w:pPr>
             <w:r>
+              <w:rPr>
+                <w:rFonts w:ascii="Arial" w:hAnsi="Arial" w:cs="Arial" w:eastAsia="Microsoft YaHei"/>
+              </w:rPr>
               <w:t>数据区</w:t>
             </w:r>
           </w:p>
@@ -2480,6 +2712,9 @@
               <w:jc w:val="left"/>
             </w:pPr>
             <w:r>
+              <w:rPr>
+                <w:rFonts w:ascii="Arial" w:hAnsi="Arial" w:cs="Arial" w:eastAsia="Microsoft YaHei"/>
+              </w:rPr>
               <w:t>SOH保存文件数据；EOT和CAN固定填充0xFF</w:t>
             </w:r>
           </w:p>
@@ -2514,6 +2749,9 @@
               <w:jc w:val="center"/>
             </w:pPr>
             <w:r>
+              <w:rPr>
+                <w:rFonts w:ascii="Arial" w:hAnsi="Arial" w:cs="Arial" w:eastAsia="Microsoft YaHei"/>
+              </w:rPr>
               <w:t>133至134</w:t>
             </w:r>
           </w:p>
@@ -2543,6 +2781,9 @@
               <w:jc w:val="center"/>
             </w:pPr>
             <w:r>
+              <w:rPr>
+                <w:rFonts w:ascii="Arial" w:hAnsi="Arial" w:cs="Arial" w:eastAsia="Microsoft YaHei"/>
+              </w:rPr>
               <w:t>2</w:t>
             </w:r>
           </w:p>
@@ -2572,6 +2813,9 @@
               <w:jc w:val="left"/>
             </w:pPr>
             <w:r>
+              <w:rPr>
+                <w:rFonts w:ascii="Arial" w:hAnsi="Arial" w:cs="Arial" w:eastAsia="Microsoft YaHei"/>
+              </w:rPr>
               <w:t>CRC16</w:t>
             </w:r>
           </w:p>
@@ -2601,6 +2845,9 @@
               <w:jc w:val="left"/>
             </w:pPr>
             <w:r>
+              <w:rPr>
+                <w:rFonts w:ascii="Arial" w:hAnsi="Arial" w:cs="Arial" w:eastAsia="Microsoft YaHei"/>
+              </w:rPr>
               <w:t>高字节在前；覆盖偏移0至132共133字节</w:t>
             </w:r>
           </w:p>
@@ -2614,6 +2861,9 @@
     </w:p>
     <w:p>
       <w:r>
+        <w:rPr>
+          <w:rFonts w:ascii="Arial" w:hAnsi="Arial" w:cs="Arial" w:eastAsia="Microsoft YaHei"/>
+        </w:rPr>
         <w:t>总帧长固定为135字节。CRC覆盖帧类型，可以防止SOH受到干扰后被错误识别为EOT。接收端先把完整帧放入临时缓冲区，验证CRC和序号后才能写入目标内存或Flash。</w:t>
       </w:r>
     </w:p>
@@ -2622,6 +2872,9 @@
         <w:pStyle w:val="Heading1"/>
       </w:pPr>
       <w:r>
+        <w:rPr>
+          <w:rFonts w:ascii="Arial" w:hAnsi="Arial" w:cs="Arial" w:eastAsia="Microsoft YaHei"/>
+        </w:rPr>
         <w:t>6 CRC16规定</w:t>
       </w:r>
     </w:p>
@@ -2667,6 +2920,7 @@
             </w:pPr>
             <w:r>
               <w:rPr>
+                <w:rFonts w:ascii="Arial" w:hAnsi="Arial" w:cs="Arial" w:eastAsia="Microsoft YaHei"/>
                 <w:b/>
                 <w:color w:val="FFFFFF"/>
               </w:rPr>
@@ -2700,6 +2954,7 @@
             </w:pPr>
             <w:r>
               <w:rPr>
+                <w:rFonts w:ascii="Arial" w:hAnsi="Arial" w:cs="Arial" w:eastAsia="Microsoft YaHei"/>
                 <w:b/>
                 <w:color w:val="FFFFFF"/>
               </w:rPr>
@@ -2736,6 +2991,9 @@
               <w:jc w:val="center"/>
             </w:pPr>
             <w:r>
+              <w:rPr>
+                <w:rFonts w:ascii="Arial" w:hAnsi="Arial" w:cs="Arial" w:eastAsia="Microsoft YaHei"/>
+              </w:rPr>
               <w:t>算法</w:t>
             </w:r>
           </w:p>
@@ -2764,6 +3022,9 @@
               <w:jc w:val="center"/>
             </w:pPr>
             <w:r>
+              <w:rPr>
+                <w:rFonts w:ascii="Arial" w:hAnsi="Arial" w:cs="Arial" w:eastAsia="Microsoft YaHei"/>
+              </w:rPr>
               <w:t>CRC16-CCITT-FALSE</w:t>
             </w:r>
           </w:p>
@@ -2798,6 +3059,9 @@
               <w:jc w:val="center"/>
             </w:pPr>
             <w:r>
+              <w:rPr>
+                <w:rFonts w:ascii="Arial" w:hAnsi="Arial" w:cs="Arial" w:eastAsia="Microsoft YaHei"/>
+              </w:rPr>
               <w:t>多项式</w:t>
             </w:r>
           </w:p>
@@ -2827,6 +3091,9 @@
               <w:jc w:val="center"/>
             </w:pPr>
             <w:r>
+              <w:rPr>
+                <w:rFonts w:ascii="Arial" w:hAnsi="Arial" w:cs="Arial" w:eastAsia="Microsoft YaHei"/>
+              </w:rPr>
               <w:t>0x1021</w:t>
             </w:r>
           </w:p>
@@ -2860,6 +3127,9 @@
               <w:jc w:val="center"/>
             </w:pPr>
             <w:r>
+              <w:rPr>
+                <w:rFonts w:ascii="Arial" w:hAnsi="Arial" w:cs="Arial" w:eastAsia="Microsoft YaHei"/>
+              </w:rPr>
               <w:t>初始值</w:t>
             </w:r>
           </w:p>
@@ -2888,6 +3158,9 @@
               <w:jc w:val="center"/>
             </w:pPr>
             <w:r>
+              <w:rPr>
+                <w:rFonts w:ascii="Arial" w:hAnsi="Arial" w:cs="Arial" w:eastAsia="Microsoft YaHei"/>
+              </w:rPr>
               <w:t>0xFFFF</w:t>
             </w:r>
           </w:p>
@@ -2922,6 +3195,9 @@
               <w:jc w:val="center"/>
             </w:pPr>
             <w:r>
+              <w:rPr>
+                <w:rFonts w:ascii="Arial" w:hAnsi="Arial" w:cs="Arial" w:eastAsia="Microsoft YaHei"/>
+              </w:rPr>
               <w:t>输入反转</w:t>
             </w:r>
           </w:p>
@@ -2951,6 +3227,9 @@
               <w:jc w:val="center"/>
             </w:pPr>
             <w:r>
+              <w:rPr>
+                <w:rFonts w:ascii="Arial" w:hAnsi="Arial" w:cs="Arial" w:eastAsia="Microsoft YaHei"/>
+              </w:rPr>
               <w:t>否</w:t>
             </w:r>
           </w:p>
@@ -2984,6 +3263,9 @@
               <w:jc w:val="center"/>
             </w:pPr>
             <w:r>
+              <w:rPr>
+                <w:rFonts w:ascii="Arial" w:hAnsi="Arial" w:cs="Arial" w:eastAsia="Microsoft YaHei"/>
+              </w:rPr>
               <w:t>输出反转</w:t>
             </w:r>
           </w:p>
@@ -3012,6 +3294,9 @@
               <w:jc w:val="center"/>
             </w:pPr>
             <w:r>
+              <w:rPr>
+                <w:rFonts w:ascii="Arial" w:hAnsi="Arial" w:cs="Arial" w:eastAsia="Microsoft YaHei"/>
+              </w:rPr>
               <w:t>否</w:t>
             </w:r>
           </w:p>
@@ -3046,6 +3331,9 @@
               <w:jc w:val="center"/>
             </w:pPr>
             <w:r>
+              <w:rPr>
+                <w:rFonts w:ascii="Arial" w:hAnsi="Arial" w:cs="Arial" w:eastAsia="Microsoft YaHei"/>
+              </w:rPr>
               <w:t>结果异或</w:t>
             </w:r>
           </w:p>
@@ -3075,6 +3363,9 @@
               <w:jc w:val="center"/>
             </w:pPr>
             <w:r>
+              <w:rPr>
+                <w:rFonts w:ascii="Arial" w:hAnsi="Arial" w:cs="Arial" w:eastAsia="Microsoft YaHei"/>
+              </w:rPr>
               <w:t>0x0000</w:t>
             </w:r>
           </w:p>
@@ -3108,6 +3399,9 @@
               <w:jc w:val="center"/>
             </w:pPr>
             <w:r>
+              <w:rPr>
+                <w:rFonts w:ascii="Arial" w:hAnsi="Arial" w:cs="Arial" w:eastAsia="Microsoft YaHei"/>
+              </w:rPr>
               <w:t>标准校验串</w:t>
             </w:r>
           </w:p>
@@ -3136,6 +3430,9 @@
               <w:jc w:val="center"/>
             </w:pPr>
             <w:r>
+              <w:rPr>
+                <w:rFonts w:ascii="Arial" w:hAnsi="Arial" w:cs="Arial" w:eastAsia="Microsoft YaHei"/>
+              </w:rPr>
               <w:t>字符串123456789的结果为0x29B1</w:t>
             </w:r>
           </w:p>
@@ -3152,11 +3449,17 @@
         <w:pStyle w:val="Heading1"/>
       </w:pPr>
       <w:r>
+        <w:rPr>
+          <w:rFonts w:ascii="Arial" w:hAnsi="Arial" w:cs="Arial" w:eastAsia="Microsoft YaHei"/>
+        </w:rPr>
         <w:t>7 序号和文件结束规则</w:t>
       </w:r>
     </w:p>
     <w:p>
       <w:r>
+        <w:rPr>
+          <w:rFonts w:ascii="Arial" w:hAnsi="Arial" w:cs="Arial" w:eastAsia="Microsoft YaHei"/>
+        </w:rPr>
         <w:t>数据包序号从0开始连续递增。接收端使用expected_seq保存下一个期望序号。接收新包后写入128字节并执行expected_seq加1；收到expected_seq减1的包表示ACK可能丢失，接收端丢弃其数据但重新回复ACK。其他序号均回复NAK。</w:t>
       </w:r>
     </w:p>
@@ -3203,6 +3506,7 @@
             </w:pPr>
             <w:r>
               <w:rPr>
+                <w:rFonts w:ascii="Arial" w:hAnsi="Arial" w:cs="Arial" w:eastAsia="Microsoft YaHei"/>
                 <w:b/>
                 <w:color w:val="FFFFFF"/>
               </w:rPr>
@@ -3236,6 +3540,7 @@
             </w:pPr>
             <w:r>
               <w:rPr>
+                <w:rFonts w:ascii="Arial" w:hAnsi="Arial" w:cs="Arial" w:eastAsia="Microsoft YaHei"/>
                 <w:b/>
                 <w:color w:val="FFFFFF"/>
               </w:rPr>
@@ -3269,6 +3574,7 @@
             </w:pPr>
             <w:r>
               <w:rPr>
+                <w:rFonts w:ascii="Arial" w:hAnsi="Arial" w:cs="Arial" w:eastAsia="Microsoft YaHei"/>
                 <w:b/>
                 <w:color w:val="FFFFFF"/>
               </w:rPr>
@@ -3305,6 +3611,9 @@
               <w:jc w:val="center"/>
             </w:pPr>
             <w:r>
+              <w:rPr>
+                <w:rFonts w:ascii="Arial" w:hAnsi="Arial" w:cs="Arial" w:eastAsia="Microsoft YaHei"/>
+              </w:rPr>
               <w:t>SOH</w:t>
             </w:r>
           </w:p>
@@ -3333,6 +3642,9 @@
               <w:jc w:val="center"/>
             </w:pPr>
             <w:r>
+              <w:rPr>
+                <w:rFonts w:ascii="Arial" w:hAnsi="Arial" w:cs="Arial" w:eastAsia="Microsoft YaHei"/>
+              </w:rPr>
               <w:t>0</w:t>
             </w:r>
           </w:p>
@@ -3361,6 +3673,9 @@
               <w:jc w:val="left"/>
             </w:pPr>
             <w:r>
+              <w:rPr>
+                <w:rFonts w:ascii="Arial" w:hAnsi="Arial" w:cs="Arial" w:eastAsia="Microsoft YaHei"/>
+              </w:rPr>
               <w:t>写入第1个128字节，expected_seq变为1</w:t>
             </w:r>
           </w:p>
@@ -3395,6 +3710,9 @@
               <w:jc w:val="center"/>
             </w:pPr>
             <w:r>
+              <w:rPr>
+                <w:rFonts w:ascii="Arial" w:hAnsi="Arial" w:cs="Arial" w:eastAsia="Microsoft YaHei"/>
+              </w:rPr>
               <w:t>SOH</w:t>
             </w:r>
           </w:p>
@@ -3424,6 +3742,9 @@
               <w:jc w:val="center"/>
             </w:pPr>
             <w:r>
+              <w:rPr>
+                <w:rFonts w:ascii="Arial" w:hAnsi="Arial" w:cs="Arial" w:eastAsia="Microsoft YaHei"/>
+              </w:rPr>
               <w:t>1</w:t>
             </w:r>
           </w:p>
@@ -3453,6 +3774,9 @@
               <w:jc w:val="left"/>
             </w:pPr>
             <w:r>
+              <w:rPr>
+                <w:rFonts w:ascii="Arial" w:hAnsi="Arial" w:cs="Arial" w:eastAsia="Microsoft YaHei"/>
+              </w:rPr>
               <w:t>写入第2个128字节，expected_seq变为2</w:t>
             </w:r>
           </w:p>
@@ -3486,6 +3810,9 @@
               <w:jc w:val="center"/>
             </w:pPr>
             <w:r>
+              <w:rPr>
+                <w:rFonts w:ascii="Arial" w:hAnsi="Arial" w:cs="Arial" w:eastAsia="Microsoft YaHei"/>
+              </w:rPr>
               <w:t>SOH</w:t>
             </w:r>
           </w:p>
@@ -3514,6 +3841,9 @@
               <w:jc w:val="center"/>
             </w:pPr>
             <w:r>
+              <w:rPr>
+                <w:rFonts w:ascii="Arial" w:hAnsi="Arial" w:cs="Arial" w:eastAsia="Microsoft YaHei"/>
+              </w:rPr>
               <w:t>2</w:t>
             </w:r>
           </w:p>
@@ -3542,6 +3872,9 @@
               <w:jc w:val="left"/>
             </w:pPr>
             <w:r>
+              <w:rPr>
+                <w:rFonts w:ascii="Arial" w:hAnsi="Arial" w:cs="Arial" w:eastAsia="Microsoft YaHei"/>
+              </w:rPr>
               <w:t>写入第3个128字节，expected_seq变为3</w:t>
             </w:r>
           </w:p>
@@ -3576,6 +3909,9 @@
               <w:jc w:val="center"/>
             </w:pPr>
             <w:r>
+              <w:rPr>
+                <w:rFonts w:ascii="Arial" w:hAnsi="Arial" w:cs="Arial" w:eastAsia="Microsoft YaHei"/>
+              </w:rPr>
               <w:t>EOT</w:t>
             </w:r>
           </w:p>
@@ -3605,6 +3941,9 @@
               <w:jc w:val="center"/>
             </w:pPr>
             <w:r>
+              <w:rPr>
+                <w:rFonts w:ascii="Arial" w:hAnsi="Arial" w:cs="Arial" w:eastAsia="Microsoft YaHei"/>
+              </w:rPr>
               <w:t>3</w:t>
             </w:r>
           </w:p>
@@ -3634,6 +3973,9 @@
               <w:jc w:val="left"/>
             </w:pPr>
             <w:r>
+              <w:rPr>
+                <w:rFonts w:ascii="Arial" w:hAnsi="Arial" w:cs="Arial" w:eastAsia="Microsoft YaHei"/>
+              </w:rPr>
               <w:t>序号等于expected_seq，回复ACK并完成</w:t>
             </w:r>
           </w:p>
@@ -3647,6 +3989,9 @@
     </w:p>
     <w:p>
       <w:r>
+        <w:rPr>
+          <w:rFonts w:ascii="Arial" w:hAnsi="Arial" w:cs="Arial" w:eastAsia="Microsoft YaHei"/>
+        </w:rPr>
         <w:t>文件长度由成功接收的数据包数量推导：file_size = expected_seq × 128。空文件可使用序号0的EOT表示。协议不发送单独长度字段，也不对不足128字节的末包进行填充；调用方必须保证发送长度是128字节的整数倍。</w:t>
       </w:r>
     </w:p>
@@ -3655,11 +4000,17 @@
         <w:pStyle w:val="Heading2"/>
       </w:pPr>
       <w:r>
+        <w:rPr>
+          <w:rFonts w:ascii="Arial" w:hAnsi="Arial" w:cs="Arial" w:eastAsia="Microsoft YaHei"/>
+        </w:rPr>
         <w:t>基本交互时序</w:t>
       </w:r>
     </w:p>
     <w:p>
       <w:r>
+        <w:rPr>
+          <w:rFonts w:ascii="Arial" w:hAnsi="Arial" w:cs="Arial" w:eastAsia="Microsoft YaHei"/>
+        </w:rPr>
         <w:t>接收方先发送C；发送方每收到一个ACK才发送下一个SOH帧。全部数据确认后，发送方使用下一个期望序号发送EOT，并等待最终ACK。</w:t>
       </w:r>
     </w:p>
@@ -3671,7 +4022,7 @@
       </w:pPr>
       <w:r>
         <w:rPr>
-          <w:rFonts w:ascii="Courier New" w:hAnsi="Courier New"/>
+          <w:rFonts w:ascii="Courier New" w:hAnsi="Courier New" w:cs="Courier New" w:eastAsia="Microsoft YaHei"/>
           <w:sz w:val="18"/>
         </w:rPr>
         <w:t>C -&gt; SOH(0) / ACK -&gt; SOH(1) / ACK -&gt; ... -&gt; EOT(N) / ACK</w:t>
@@ -3679,6 +4030,9 @@
     </w:p>
     <w:p>
       <w:r>
+        <w:rPr>
+          <w:rFonts w:ascii="Arial" w:hAnsi="Arial" w:cs="Arial" w:eastAsia="Microsoft YaHei"/>
+        </w:rPr>
         <w:br w:type="page"/>
       </w:r>
     </w:p>
@@ -3687,16 +4041,25 @@
         <w:pStyle w:val="Heading1"/>
       </w:pPr>
       <w:r>
+        <w:rPr>
+          <w:rFonts w:ascii="Arial" w:hAnsi="Arial" w:cs="Arial" w:eastAsia="Microsoft YaHei"/>
+        </w:rPr>
         <w:t>8 发送方程序流程</w:t>
       </w:r>
     </w:p>
     <w:p>
       <w:r>
+        <w:rPr>
+          <w:rFonts w:ascii="Arial" w:hAnsi="Arial" w:cs="Arial" w:eastAsia="Microsoft YaHei"/>
+        </w:rPr>
         <w:t>发送流程适用于上位机和下位机。发送方先等待接收方的C，再逐包执行发送与确认。EOT同样等待ACK；任何帧超过60次重试后发送CAN并结束。</w:t>
       </w:r>
     </w:p>
     <w:p>
       <w:r>
+        <w:rPr>
+          <w:rFonts w:ascii="Arial" w:hAnsi="Arial" w:cs="Arial" w:eastAsia="Microsoft YaHei"/>
+        </w:rPr>
         <w:drawing>
           <wp:inline xmlns:a="http://schemas.openxmlformats.org/drawingml/2006/main" xmlns:pic="http://schemas.openxmlformats.org/drawingml/2006/picture">
             <wp:extent cx="4892040" cy="5809298"/>
@@ -3738,6 +4101,7 @@
       </w:pPr>
       <w:r>
         <w:rPr>
+          <w:rFonts w:ascii="Arial" w:hAnsi="Arial" w:cs="Arial" w:eastAsia="Microsoft YaHei"/>
           <w:b/>
           <w:sz w:val="18"/>
         </w:rPr>
@@ -3746,6 +4110,9 @@
     </w:p>
     <w:p>
       <w:r>
+        <w:rPr>
+          <w:rFonts w:ascii="Arial" w:hAnsi="Arial" w:cs="Arial" w:eastAsia="Microsoft YaHei"/>
+        </w:rPr>
         <w:br w:type="page"/>
       </w:r>
     </w:p>
@@ -3754,16 +4121,25 @@
         <w:pStyle w:val="Heading1"/>
       </w:pPr>
       <w:r>
+        <w:rPr>
+          <w:rFonts w:ascii="Arial" w:hAnsi="Arial" w:cs="Arial" w:eastAsia="Microsoft YaHei"/>
+        </w:rPr>
         <w:t>9 接收方程序流程</w:t>
       </w:r>
     </w:p>
     <w:p>
       <w:r>
+        <w:rPr>
+          <w:rFonts w:ascii="Arial" w:hAnsi="Arial" w:cs="Arial" w:eastAsia="Microsoft YaHei"/>
+        </w:rPr>
         <w:t>接收流程同样适用于上位机和下位机。接收方先周期发送C，正常接收后进入固定帧状态机。成功接收EOT后进入完成等待状态；如果EOT的ACK丢失，重复EOT仍会得到ACK。连续两个重发周期未收到重复EOT后退出完成状态。</w:t>
       </w:r>
     </w:p>
     <w:p>
       <w:r>
+        <w:rPr>
+          <w:rFonts w:ascii="Arial" w:hAnsi="Arial" w:cs="Arial" w:eastAsia="Microsoft YaHei"/>
+        </w:rPr>
         <w:drawing>
           <wp:inline xmlns:a="http://schemas.openxmlformats.org/drawingml/2006/main" xmlns:pic="http://schemas.openxmlformats.org/drawingml/2006/picture">
             <wp:extent cx="4892040" cy="5503545"/>
@@ -3805,6 +4181,7 @@
       </w:pPr>
       <w:r>
         <w:rPr>
+          <w:rFonts w:ascii="Arial" w:hAnsi="Arial" w:cs="Arial" w:eastAsia="Microsoft YaHei"/>
           <w:b/>
           <w:sz w:val="18"/>
         </w:rPr>
@@ -3813,6 +4190,9 @@
     </w:p>
     <w:p>
       <w:r>
+        <w:rPr>
+          <w:rFonts w:ascii="Arial" w:hAnsi="Arial" w:cs="Arial" w:eastAsia="Microsoft YaHei"/>
+        </w:rPr>
         <w:br w:type="page"/>
       </w:r>
     </w:p>
@@ -3821,16 +4201,25 @@
         <w:pStyle w:val="Heading1"/>
       </w:pPr>
       <w:r>
+        <w:rPr>
+          <w:rFonts w:ascii="Arial" w:hAnsi="Arial" w:cs="Arial" w:eastAsia="Microsoft YaHei"/>
+        </w:rPr>
         <w:t>10 上位机Python APP流程</w:t>
       </w:r>
     </w:p>
     <w:p>
       <w:r>
+        <w:rPr>
+          <w:rFonts w:ascii="Arial" w:hAnsi="Arial" w:cs="Arial" w:eastAsia="Microsoft YaHei"/>
+        </w:rPr>
         <w:t>上位机APP使用Tkinter界面，并在后台线程执行串口传输，避免界面阻塞。用户选择串口和波特率后，可选择发送文件，也可选择接收文件保存位置。协议模块与界面分离，界面不直接处理帧。</w:t>
       </w:r>
     </w:p>
     <w:p>
       <w:r>
+        <w:rPr>
+          <w:rFonts w:ascii="Arial" w:hAnsi="Arial" w:cs="Arial" w:eastAsia="Microsoft YaHei"/>
+        </w:rPr>
         <w:drawing>
           <wp:inline xmlns:a="http://schemas.openxmlformats.org/drawingml/2006/main" xmlns:pic="http://schemas.openxmlformats.org/drawingml/2006/picture">
             <wp:extent cx="5989320" cy="4679156"/>
@@ -3872,6 +4261,7 @@
       </w:pPr>
       <w:r>
         <w:rPr>
+          <w:rFonts w:ascii="Arial" w:hAnsi="Arial" w:cs="Arial" w:eastAsia="Microsoft YaHei"/>
           <w:b/>
           <w:sz w:val="18"/>
         </w:rPr>
@@ -3883,11 +4273,17 @@
         <w:pStyle w:val="Heading1"/>
       </w:pPr>
       <w:r>
+        <w:rPr>
+          <w:rFonts w:ascii="Arial" w:hAnsi="Arial" w:cs="Arial" w:eastAsia="Microsoft YaHei"/>
+        </w:rPr>
         <w:t>11 下位机程序流程</w:t>
       </w:r>
     </w:p>
     <w:p>
       <w:r>
+        <w:rPr>
+          <w:rFonts w:ascii="Arial" w:hAnsi="Arial" w:cs="Arial" w:eastAsia="Microsoft YaHei"/>
+        </w:rPr>
         <w:t>下位机根据业务命令进入发送或接收角色。进入接收角色时，使用图2状态机，将正确的新数据包写入缓存或Flash；进入发送角色时，使用图1状态机，从指定内存区域读取128字节数据。下位机应采用独立临时帧缓冲区，完成CRC和序号检查之后再修改目标存储区。</w:t>
       </w:r>
     </w:p>
@@ -3933,6 +4329,7 @@
             </w:pPr>
             <w:r>
               <w:rPr>
+                <w:rFonts w:ascii="Arial" w:hAnsi="Arial" w:cs="Arial" w:eastAsia="Microsoft YaHei"/>
                 <w:b/>
                 <w:color w:val="FFFFFF"/>
               </w:rPr>
@@ -3966,6 +4363,7 @@
             </w:pPr>
             <w:r>
               <w:rPr>
+                <w:rFonts w:ascii="Arial" w:hAnsi="Arial" w:cs="Arial" w:eastAsia="Microsoft YaHei"/>
                 <w:b/>
                 <w:color w:val="FFFFFF"/>
               </w:rPr>
@@ -4002,6 +4400,9 @@
               <w:jc w:val="center"/>
             </w:pPr>
             <w:r>
+              <w:rPr>
+                <w:rFonts w:ascii="Arial" w:hAnsi="Arial" w:cs="Arial" w:eastAsia="Microsoft YaHei"/>
+              </w:rPr>
               <w:t>串口驱动层</w:t>
             </w:r>
           </w:p>
@@ -4030,6 +4431,9 @@
               <w:jc w:val="center"/>
             </w:pPr>
             <w:r>
+              <w:rPr>
+                <w:rFonts w:ascii="Arial" w:hAnsi="Arial" w:cs="Arial" w:eastAsia="Microsoft YaHei"/>
+              </w:rPr>
               <w:t>发送和接收字节，提供1秒超时，RS485时控制收发方向</w:t>
             </w:r>
           </w:p>
@@ -4064,6 +4468,9 @@
               <w:jc w:val="center"/>
             </w:pPr>
             <w:r>
+              <w:rPr>
+                <w:rFonts w:ascii="Arial" w:hAnsi="Arial" w:cs="Arial" w:eastAsia="Microsoft YaHei"/>
+              </w:rPr>
               <w:t>协议层</w:t>
             </w:r>
           </w:p>
@@ -4093,6 +4500,9 @@
               <w:jc w:val="center"/>
             </w:pPr>
             <w:r>
+              <w:rPr>
+                <w:rFonts w:ascii="Arial" w:hAnsi="Arial" w:cs="Arial" w:eastAsia="Microsoft YaHei"/>
+              </w:rPr>
               <w:t>组帧、解帧、CRC16、序号检查、ACK与NAK、60次重试</w:t>
             </w:r>
           </w:p>
@@ -4126,6 +4536,9 @@
               <w:jc w:val="center"/>
             </w:pPr>
             <w:r>
+              <w:rPr>
+                <w:rFonts w:ascii="Arial" w:hAnsi="Arial" w:cs="Arial" w:eastAsia="Microsoft YaHei"/>
+              </w:rPr>
               <w:t>存储层</w:t>
             </w:r>
           </w:p>
@@ -4154,6 +4567,9 @@
               <w:jc w:val="center"/>
             </w:pPr>
             <w:r>
+              <w:rPr>
+                <w:rFonts w:ascii="Arial" w:hAnsi="Arial" w:cs="Arial" w:eastAsia="Microsoft YaHei"/>
+              </w:rPr>
               <w:t>按128字节读取或写入；写入失败时不得回复ACK</w:t>
             </w:r>
           </w:p>
@@ -4188,6 +4604,9 @@
               <w:jc w:val="center"/>
             </w:pPr>
             <w:r>
+              <w:rPr>
+                <w:rFonts w:ascii="Arial" w:hAnsi="Arial" w:cs="Arial" w:eastAsia="Microsoft YaHei"/>
+              </w:rPr>
               <w:t>应用层</w:t>
             </w:r>
           </w:p>
@@ -4217,6 +4636,9 @@
               <w:jc w:val="center"/>
             </w:pPr>
             <w:r>
+              <w:rPr>
+                <w:rFonts w:ascii="Arial" w:hAnsi="Arial" w:cs="Arial" w:eastAsia="Microsoft YaHei"/>
+              </w:rPr>
               <w:t>决定发送或接收角色，检查固件合法性，处理成功、失败和取消</w:t>
             </w:r>
           </w:p>
@@ -4233,11 +4655,17 @@
         <w:pStyle w:val="Heading1"/>
       </w:pPr>
       <w:r>
+        <w:rPr>
+          <w:rFonts w:ascii="Arial" w:hAnsi="Arial" w:cs="Arial" w:eastAsia="Microsoft YaHei"/>
+        </w:rPr>
         <w:t>12 Python协议模块接口</w:t>
       </w:r>
     </w:p>
     <w:p>
       <w:r>
+        <w:rPr>
+          <w:rFonts w:ascii="Arial" w:hAnsi="Arial" w:cs="Arial" w:eastAsia="Microsoft YaHei"/>
+        </w:rPr>
         <w:t>FFRTP-128 Python协议模块仅提供一个公开入口。memory的类型用于确定方向，因此不额外增加mode参数。</w:t>
       </w:r>
     </w:p>
@@ -4249,7 +4677,7 @@
       </w:pPr>
       <w:r>
         <w:rPr>
-          <w:rFonts w:ascii="Courier New" w:hAnsi="Courier New"/>
+          <w:rFonts w:ascii="Courier New" w:hAnsi="Courier New" w:cs="Courier New" w:eastAsia="Microsoft YaHei"/>
           <w:sz w:val="18"/>
         </w:rPr>
         <w:t>transfer(memory, port, baudrate) -&gt; TransferResult</w:t>
@@ -4298,6 +4726,7 @@
             </w:pPr>
             <w:r>
               <w:rPr>
+                <w:rFonts w:ascii="Arial" w:hAnsi="Arial" w:cs="Arial" w:eastAsia="Microsoft YaHei"/>
                 <w:b/>
                 <w:color w:val="FFFFFF"/>
               </w:rPr>
@@ -4331,6 +4760,7 @@
             </w:pPr>
             <w:r>
               <w:rPr>
+                <w:rFonts w:ascii="Arial" w:hAnsi="Arial" w:cs="Arial" w:eastAsia="Microsoft YaHei"/>
                 <w:b/>
                 <w:color w:val="FFFFFF"/>
               </w:rPr>
@@ -4364,6 +4794,7 @@
             </w:pPr>
             <w:r>
               <w:rPr>
+                <w:rFonts w:ascii="Arial" w:hAnsi="Arial" w:cs="Arial" w:eastAsia="Microsoft YaHei"/>
                 <w:b/>
                 <w:color w:val="FFFFFF"/>
               </w:rPr>
@@ -4400,6 +4831,9 @@
               <w:jc w:val="center"/>
             </w:pPr>
             <w:r>
+              <w:rPr>
+                <w:rFonts w:ascii="Arial" w:hAnsi="Arial" w:cs="Arial" w:eastAsia="Microsoft YaHei"/>
+              </w:rPr>
               <w:t>memory</w:t>
             </w:r>
           </w:p>
@@ -4428,6 +4862,9 @@
               <w:jc w:val="center"/>
             </w:pPr>
             <w:r>
+              <w:rPr>
+                <w:rFonts w:ascii="Arial" w:hAnsi="Arial" w:cs="Arial" w:eastAsia="Microsoft YaHei"/>
+              </w:rPr>
               <w:t>bytes</w:t>
             </w:r>
           </w:p>
@@ -4456,6 +4893,9 @@
               <w:jc w:val="left"/>
             </w:pPr>
             <w:r>
+              <w:rPr>
+                <w:rFonts w:ascii="Arial" w:hAnsi="Arial" w:cs="Arial" w:eastAsia="Microsoft YaHei"/>
+              </w:rPr>
               <w:t>发送模式，内容为待发送文件；长度必须是128的整数倍</w:t>
             </w:r>
           </w:p>
@@ -4490,6 +4930,9 @@
               <w:jc w:val="center"/>
             </w:pPr>
             <w:r>
+              <w:rPr>
+                <w:rFonts w:ascii="Arial" w:hAnsi="Arial" w:cs="Arial" w:eastAsia="Microsoft YaHei"/>
+              </w:rPr>
               <w:t>memory</w:t>
             </w:r>
           </w:p>
@@ -4519,6 +4962,9 @@
               <w:jc w:val="center"/>
             </w:pPr>
             <w:r>
+              <w:rPr>
+                <w:rFonts w:ascii="Arial" w:hAnsi="Arial" w:cs="Arial" w:eastAsia="Microsoft YaHei"/>
+              </w:rPr>
               <w:t>bytearray</w:t>
             </w:r>
           </w:p>
@@ -4548,6 +4994,9 @@
               <w:jc w:val="left"/>
             </w:pPr>
             <w:r>
+              <w:rPr>
+                <w:rFonts w:ascii="Arial" w:hAnsi="Arial" w:cs="Arial" w:eastAsia="Microsoft YaHei"/>
+              </w:rPr>
               <w:t>接收模式，入口会先清空原内容，再写入收到的文件</w:t>
             </w:r>
           </w:p>
@@ -4581,6 +5030,9 @@
               <w:jc w:val="center"/>
             </w:pPr>
             <w:r>
+              <w:rPr>
+                <w:rFonts w:ascii="Arial" w:hAnsi="Arial" w:cs="Arial" w:eastAsia="Microsoft YaHei"/>
+              </w:rPr>
               <w:t>port</w:t>
             </w:r>
           </w:p>
@@ -4609,6 +5061,9 @@
               <w:jc w:val="center"/>
             </w:pPr>
             <w:r>
+              <w:rPr>
+                <w:rFonts w:ascii="Arial" w:hAnsi="Arial" w:cs="Arial" w:eastAsia="Microsoft YaHei"/>
+              </w:rPr>
               <w:t>str</w:t>
             </w:r>
           </w:p>
@@ -4637,6 +5092,9 @@
               <w:jc w:val="left"/>
             </w:pPr>
             <w:r>
+              <w:rPr>
+                <w:rFonts w:ascii="Arial" w:hAnsi="Arial" w:cs="Arial" w:eastAsia="Microsoft YaHei"/>
+              </w:rPr>
               <w:t>串口号，例如COM3或/dev/ttyUSB0</w:t>
             </w:r>
           </w:p>
@@ -4671,6 +5129,9 @@
               <w:jc w:val="center"/>
             </w:pPr>
             <w:r>
+              <w:rPr>
+                <w:rFonts w:ascii="Arial" w:hAnsi="Arial" w:cs="Arial" w:eastAsia="Microsoft YaHei"/>
+              </w:rPr>
               <w:t>baudrate</w:t>
             </w:r>
           </w:p>
@@ -4700,6 +5161,9 @@
               <w:jc w:val="center"/>
             </w:pPr>
             <w:r>
+              <w:rPr>
+                <w:rFonts w:ascii="Arial" w:hAnsi="Arial" w:cs="Arial" w:eastAsia="Microsoft YaHei"/>
+              </w:rPr>
               <w:t>int</w:t>
             </w:r>
           </w:p>
@@ -4729,6 +5193,9 @@
               <w:jc w:val="left"/>
             </w:pPr>
             <w:r>
+              <w:rPr>
+                <w:rFonts w:ascii="Arial" w:hAnsi="Arial" w:cs="Arial" w:eastAsia="Microsoft YaHei"/>
+              </w:rPr>
               <w:t>双方一致的波特率，例如115200或921600</w:t>
             </w:r>
           </w:p>
@@ -4748,7 +5215,7 @@
       </w:pPr>
       <w:r>
         <w:rPr>
-          <w:rFonts w:ascii="Courier New" w:hAnsi="Courier New"/>
+          <w:rFonts w:ascii="Courier New" w:hAnsi="Courier New" w:cs="Courier New" w:eastAsia="Microsoft YaHei"/>
           <w:sz w:val="18"/>
         </w:rPr>
         <w:t>from ffrtp128 import transfer</w:t>
@@ -4775,6 +5242,9 @@
         <w:pStyle w:val="Heading1"/>
       </w:pPr>
       <w:r>
+        <w:rPr>
+          <w:rFonts w:ascii="Arial" w:hAnsi="Arial" w:cs="Arial" w:eastAsia="Microsoft YaHei"/>
+        </w:rPr>
         <w:t>13 异常处理规定</w:t>
       </w:r>
     </w:p>
@@ -4821,6 +5291,7 @@
             </w:pPr>
             <w:r>
               <w:rPr>
+                <w:rFonts w:ascii="Arial" w:hAnsi="Arial" w:cs="Arial" w:eastAsia="Microsoft YaHei"/>
                 <w:b/>
                 <w:color w:val="FFFFFF"/>
               </w:rPr>
@@ -4854,6 +5325,7 @@
             </w:pPr>
             <w:r>
               <w:rPr>
+                <w:rFonts w:ascii="Arial" w:hAnsi="Arial" w:cs="Arial" w:eastAsia="Microsoft YaHei"/>
                 <w:b/>
                 <w:color w:val="FFFFFF"/>
               </w:rPr>
@@ -4887,6 +5359,7 @@
             </w:pPr>
             <w:r>
               <w:rPr>
+                <w:rFonts w:ascii="Arial" w:hAnsi="Arial" w:cs="Arial" w:eastAsia="Microsoft YaHei"/>
                 <w:b/>
                 <w:color w:val="FFFFFF"/>
               </w:rPr>
@@ -4923,6 +5396,9 @@
               <w:jc w:val="center"/>
             </w:pPr>
             <w:r>
+              <w:rPr>
+                <w:rFonts w:ascii="Arial" w:hAnsi="Arial" w:cs="Arial" w:eastAsia="Microsoft YaHei"/>
+              </w:rPr>
               <w:t>CRC错误</w:t>
             </w:r>
           </w:p>
@@ -4951,6 +5427,9 @@
               <w:jc w:val="center"/>
             </w:pPr>
             <w:r>
+              <w:rPr>
+                <w:rFonts w:ascii="Arial" w:hAnsi="Arial" w:cs="Arial" w:eastAsia="Microsoft YaHei"/>
+              </w:rPr>
               <w:t>回复NAK，不写入数据</w:t>
             </w:r>
           </w:p>
@@ -4979,6 +5458,9 @@
               <w:jc w:val="left"/>
             </w:pPr>
             <w:r>
+              <w:rPr>
+                <w:rFonts w:ascii="Arial" w:hAnsi="Arial" w:cs="Arial" w:eastAsia="Microsoft YaHei"/>
+              </w:rPr>
               <w:t>重发当前完整帧</w:t>
             </w:r>
           </w:p>
@@ -5013,6 +5495,9 @@
               <w:jc w:val="center"/>
             </w:pPr>
             <w:r>
+              <w:rPr>
+                <w:rFonts w:ascii="Arial" w:hAnsi="Arial" w:cs="Arial" w:eastAsia="Microsoft YaHei"/>
+              </w:rPr>
               <w:t>期望序号</w:t>
             </w:r>
           </w:p>
@@ -5042,6 +5527,9 @@
               <w:jc w:val="center"/>
             </w:pPr>
             <w:r>
+              <w:rPr>
+                <w:rFonts w:ascii="Arial" w:hAnsi="Arial" w:cs="Arial" w:eastAsia="Microsoft YaHei"/>
+              </w:rPr>
               <w:t>写入128字节，expected_seq加1，回复ACK</w:t>
             </w:r>
           </w:p>
@@ -5071,6 +5559,9 @@
               <w:jc w:val="left"/>
             </w:pPr>
             <w:r>
+              <w:rPr>
+                <w:rFonts w:ascii="Arial" w:hAnsi="Arial" w:cs="Arial" w:eastAsia="Microsoft YaHei"/>
+              </w:rPr>
               <w:t>收到ACK后发送下一包</w:t>
             </w:r>
           </w:p>
@@ -5104,6 +5595,9 @@
               <w:jc w:val="center"/>
             </w:pPr>
             <w:r>
+              <w:rPr>
+                <w:rFonts w:ascii="Arial" w:hAnsi="Arial" w:cs="Arial" w:eastAsia="Microsoft YaHei"/>
+              </w:rPr>
               <w:t>重复上一序号</w:t>
             </w:r>
           </w:p>
@@ -5132,6 +5626,9 @@
               <w:jc w:val="center"/>
             </w:pPr>
             <w:r>
+              <w:rPr>
+                <w:rFonts w:ascii="Arial" w:hAnsi="Arial" w:cs="Arial" w:eastAsia="Microsoft YaHei"/>
+              </w:rPr>
               <w:t>不写入、不递增，重新回复ACK</w:t>
             </w:r>
           </w:p>
@@ -5160,6 +5657,9 @@
               <w:jc w:val="left"/>
             </w:pPr>
             <w:r>
+              <w:rPr>
+                <w:rFonts w:ascii="Arial" w:hAnsi="Arial" w:cs="Arial" w:eastAsia="Microsoft YaHei"/>
+              </w:rPr>
               <w:t>收到ACK后继续</w:t>
             </w:r>
           </w:p>
@@ -5194,6 +5694,9 @@
               <w:jc w:val="center"/>
             </w:pPr>
             <w:r>
+              <w:rPr>
+                <w:rFonts w:ascii="Arial" w:hAnsi="Arial" w:cs="Arial" w:eastAsia="Microsoft YaHei"/>
+              </w:rPr>
               <w:t>跳号或旧包</w:t>
             </w:r>
           </w:p>
@@ -5223,6 +5726,9 @@
               <w:jc w:val="center"/>
             </w:pPr>
             <w:r>
+              <w:rPr>
+                <w:rFonts w:ascii="Arial" w:hAnsi="Arial" w:cs="Arial" w:eastAsia="Microsoft YaHei"/>
+              </w:rPr>
               <w:t>回复NAK</w:t>
             </w:r>
           </w:p>
@@ -5252,6 +5758,9 @@
               <w:jc w:val="left"/>
             </w:pPr>
             <w:r>
+              <w:rPr>
+                <w:rFonts w:ascii="Arial" w:hAnsi="Arial" w:cs="Arial" w:eastAsia="Microsoft YaHei"/>
+              </w:rPr>
               <w:t>重发当前帧</w:t>
             </w:r>
           </w:p>
@@ -5285,6 +5794,9 @@
               <w:jc w:val="center"/>
             </w:pPr>
             <w:r>
+              <w:rPr>
+                <w:rFonts w:ascii="Arial" w:hAnsi="Arial" w:cs="Arial" w:eastAsia="Microsoft YaHei"/>
+              </w:rPr>
               <w:t>等待超时</w:t>
             </w:r>
           </w:p>
@@ -5313,6 +5825,9 @@
               <w:jc w:val="center"/>
             </w:pPr>
             <w:r>
+              <w:rPr>
+                <w:rFonts w:ascii="Arial" w:hAnsi="Arial" w:cs="Arial" w:eastAsia="Microsoft YaHei"/>
+              </w:rPr>
               <w:t>回复NAK并累计失败次数</w:t>
             </w:r>
           </w:p>
@@ -5341,6 +5856,9 @@
               <w:jc w:val="left"/>
             </w:pPr>
             <w:r>
+              <w:rPr>
+                <w:rFonts w:ascii="Arial" w:hAnsi="Arial" w:cs="Arial" w:eastAsia="Microsoft YaHei"/>
+              </w:rPr>
               <w:t>重发并累计重试次数</w:t>
             </w:r>
           </w:p>
@@ -5375,6 +5893,9 @@
               <w:jc w:val="center"/>
             </w:pPr>
             <w:r>
+              <w:rPr>
+                <w:rFonts w:ascii="Arial" w:hAnsi="Arial" w:cs="Arial" w:eastAsia="Microsoft YaHei"/>
+              </w:rPr>
               <w:t>有效EOT</w:t>
             </w:r>
           </w:p>
@@ -5404,6 +5925,9 @@
               <w:jc w:val="center"/>
             </w:pPr>
             <w:r>
+              <w:rPr>
+                <w:rFonts w:ascii="Arial" w:hAnsi="Arial" w:cs="Arial" w:eastAsia="Microsoft YaHei"/>
+              </w:rPr>
               <w:t>回复ACK并保持完成等待</w:t>
             </w:r>
           </w:p>
@@ -5433,6 +5957,9 @@
               <w:jc w:val="left"/>
             </w:pPr>
             <w:r>
+              <w:rPr>
+                <w:rFonts w:ascii="Arial" w:hAnsi="Arial" w:cs="Arial" w:eastAsia="Microsoft YaHei"/>
+              </w:rPr>
               <w:t>收到ACK后完成</w:t>
             </w:r>
           </w:p>
@@ -5466,6 +5993,9 @@
               <w:jc w:val="center"/>
             </w:pPr>
             <w:r>
+              <w:rPr>
+                <w:rFonts w:ascii="Arial" w:hAnsi="Arial" w:cs="Arial" w:eastAsia="Microsoft YaHei"/>
+              </w:rPr>
               <w:t>重复EOT</w:t>
             </w:r>
           </w:p>
@@ -5494,6 +6024,9 @@
               <w:jc w:val="center"/>
             </w:pPr>
             <w:r>
+              <w:rPr>
+                <w:rFonts w:ascii="Arial" w:hAnsi="Arial" w:cs="Arial" w:eastAsia="Microsoft YaHei"/>
+              </w:rPr>
               <w:t>再次回复ACK并延长完成等待</w:t>
             </w:r>
           </w:p>
@@ -5522,6 +6055,9 @@
               <w:jc w:val="left"/>
             </w:pPr>
             <w:r>
+              <w:rPr>
+                <w:rFonts w:ascii="Arial" w:hAnsi="Arial" w:cs="Arial" w:eastAsia="Microsoft YaHei"/>
+              </w:rPr>
               <w:t>收到ACK后完成</w:t>
             </w:r>
           </w:p>
@@ -5556,6 +6092,9 @@
               <w:jc w:val="center"/>
             </w:pPr>
             <w:r>
+              <w:rPr>
+                <w:rFonts w:ascii="Arial" w:hAnsi="Arial" w:cs="Arial" w:eastAsia="Microsoft YaHei"/>
+              </w:rPr>
               <w:t>超过60次</w:t>
             </w:r>
           </w:p>
@@ -5585,6 +6124,9 @@
               <w:jc w:val="center"/>
             </w:pPr>
             <w:r>
+              <w:rPr>
+                <w:rFonts w:ascii="Arial" w:hAnsi="Arial" w:cs="Arial" w:eastAsia="Microsoft YaHei"/>
+              </w:rPr>
               <w:t>终止并报告失败</w:t>
             </w:r>
           </w:p>
@@ -5614,6 +6156,9 @@
               <w:jc w:val="left"/>
             </w:pPr>
             <w:r>
+              <w:rPr>
+                <w:rFonts w:ascii="Arial" w:hAnsi="Arial" w:cs="Arial" w:eastAsia="Microsoft YaHei"/>
+              </w:rPr>
               <w:t>发送CAN帧并报告失败</w:t>
             </w:r>
           </w:p>
@@ -5630,16 +6175,25 @@
         <w:pStyle w:val="Heading1"/>
       </w:pPr>
       <w:r>
+        <w:rPr>
+          <w:rFonts w:ascii="Arial" w:hAnsi="Arial" w:cs="Arial" w:eastAsia="Microsoft YaHei"/>
+        </w:rPr>
         <w:t>14 实施限制</w:t>
       </w:r>
     </w:p>
     <w:p>
       <w:r>
+        <w:rPr>
+          <w:rFonts w:ascii="Arial" w:hAnsi="Arial" w:cs="Arial" w:eastAsia="Microsoft YaHei"/>
+        </w:rPr>
         <w:t>协议采用单字节ACK和NAK，适合有序、低延迟的UART或RS485链路。对于可能长期缓存、乱序或跨网络转发的链路，应把应答扩展为带序号和CRC的完整帧。当前版本不传输文件名、时间戳、权限、版本号或整文件CRC，这些信息如有需要应放入文件自身头部。</w:t>
       </w:r>
     </w:p>
     <w:p>
       <w:r>
+        <w:rPr>
+          <w:rFonts w:ascii="Arial" w:hAnsi="Arial" w:cs="Arial" w:eastAsia="Microsoft YaHei"/>
+        </w:rPr>
         <w:t>RS485半双工实现中，发送完整帧并确认最后一个停止位发出后才能切换为接收；接收方回复单字节控制值后也要等待发送完成再切换方向。双方不得同时驱动总线。</w:t>
       </w:r>
     </w:p>
@@ -5648,6 +6202,9 @@
         <w:pStyle w:val="Heading1"/>
       </w:pPr>
       <w:r>
+        <w:rPr>
+          <w:rFonts w:ascii="Arial" w:hAnsi="Arial" w:cs="Arial" w:eastAsia="Microsoft YaHei"/>
+        </w:rPr>
         <w:t>15 验收项目</w:t>
       </w:r>
     </w:p>
@@ -5695,6 +6252,7 @@
             </w:pPr>
             <w:r>
               <w:rPr>
+                <w:rFonts w:ascii="Arial" w:hAnsi="Arial" w:cs="Arial" w:eastAsia="Microsoft YaHei"/>
                 <w:b/>
                 <w:color w:val="FFFFFF"/>
                 <w:sz w:val="17"/>
@@ -5730,6 +6288,7 @@
             </w:pPr>
             <w:r>
               <w:rPr>
+                <w:rFonts w:ascii="Arial" w:hAnsi="Arial" w:cs="Arial" w:eastAsia="Microsoft YaHei"/>
                 <w:b/>
                 <w:color w:val="FFFFFF"/>
                 <w:sz w:val="17"/>
@@ -5765,6 +6324,7 @@
             </w:pPr>
             <w:r>
               <w:rPr>
+                <w:rFonts w:ascii="Arial" w:hAnsi="Arial" w:cs="Arial" w:eastAsia="Microsoft YaHei"/>
                 <w:b/>
                 <w:color w:val="FFFFFF"/>
                 <w:sz w:val="17"/>
@@ -5804,6 +6364,7 @@
             </w:pPr>
             <w:r>
               <w:rPr>
+                <w:rFonts w:ascii="Arial" w:hAnsi="Arial" w:cs="Arial" w:eastAsia="Microsoft YaHei"/>
                 <w:sz w:val="17"/>
               </w:rPr>
               <w:t>1</w:t>
@@ -5836,6 +6397,7 @@
             </w:pPr>
             <w:r>
               <w:rPr>
+                <w:rFonts w:ascii="Arial" w:hAnsi="Arial" w:cs="Arial" w:eastAsia="Microsoft YaHei"/>
                 <w:sz w:val="17"/>
               </w:rPr>
               <w:t>CRC参考值</w:t>
@@ -5868,6 +6430,7 @@
             </w:pPr>
             <w:r>
               <w:rPr>
+                <w:rFonts w:ascii="Arial" w:hAnsi="Arial" w:cs="Arial" w:eastAsia="Microsoft YaHei"/>
                 <w:sz w:val="17"/>
               </w:rPr>
               <w:t>123456789计算结果为0x29B1</w:t>
@@ -5906,6 +6469,7 @@
             </w:pPr>
             <w:r>
               <w:rPr>
+                <w:rFonts w:ascii="Arial" w:hAnsi="Arial" w:cs="Arial" w:eastAsia="Microsoft YaHei"/>
                 <w:sz w:val="17"/>
               </w:rPr>
               <w:t>2</w:t>
@@ -5939,6 +6503,7 @@
             </w:pPr>
             <w:r>
               <w:rPr>
+                <w:rFonts w:ascii="Arial" w:hAnsi="Arial" w:cs="Arial" w:eastAsia="Microsoft YaHei"/>
                 <w:sz w:val="17"/>
               </w:rPr>
               <w:t>正常传输</w:t>
@@ -5972,6 +6537,7 @@
             </w:pPr>
             <w:r>
               <w:rPr>
+                <w:rFonts w:ascii="Arial" w:hAnsi="Arial" w:cs="Arial" w:eastAsia="Microsoft YaHei"/>
                 <w:sz w:val="17"/>
               </w:rPr>
               <w:t>接收内容与发送内容逐字节一致</w:t>
@@ -6009,6 +6575,7 @@
             </w:pPr>
             <w:r>
               <w:rPr>
+                <w:rFonts w:ascii="Arial" w:hAnsi="Arial" w:cs="Arial" w:eastAsia="Microsoft YaHei"/>
                 <w:sz w:val="17"/>
               </w:rPr>
               <w:t>3</w:t>
@@ -6041,6 +6608,7 @@
             </w:pPr>
             <w:r>
               <w:rPr>
+                <w:rFonts w:ascii="Arial" w:hAnsi="Arial" w:cs="Arial" w:eastAsia="Microsoft YaHei"/>
                 <w:sz w:val="17"/>
               </w:rPr>
               <w:t>ACK丢失</w:t>
@@ -6073,6 +6641,7 @@
             </w:pPr>
             <w:r>
               <w:rPr>
+                <w:rFonts w:ascii="Arial" w:hAnsi="Arial" w:cs="Arial" w:eastAsia="Microsoft YaHei"/>
                 <w:sz w:val="17"/>
               </w:rPr>
               <w:t>发送方重发，接收方不重复写入</w:t>
@@ -6111,6 +6680,7 @@
             </w:pPr>
             <w:r>
               <w:rPr>
+                <w:rFonts w:ascii="Arial" w:hAnsi="Arial" w:cs="Arial" w:eastAsia="Microsoft YaHei"/>
                 <w:sz w:val="17"/>
               </w:rPr>
               <w:t>4</w:t>
@@ -6144,6 +6714,7 @@
             </w:pPr>
             <w:r>
               <w:rPr>
+                <w:rFonts w:ascii="Arial" w:hAnsi="Arial" w:cs="Arial" w:eastAsia="Microsoft YaHei"/>
                 <w:sz w:val="17"/>
               </w:rPr>
               <w:t>数据帧CRC错误</w:t>
@@ -6177,6 +6748,7 @@
             </w:pPr>
             <w:r>
               <w:rPr>
+                <w:rFonts w:ascii="Arial" w:hAnsi="Arial" w:cs="Arial" w:eastAsia="Microsoft YaHei"/>
                 <w:sz w:val="17"/>
               </w:rPr>
               <w:t>接收方NAK，发送方重发后成功</w:t>
@@ -6214,6 +6786,7 @@
             </w:pPr>
             <w:r>
               <w:rPr>
+                <w:rFonts w:ascii="Arial" w:hAnsi="Arial" w:cs="Arial" w:eastAsia="Microsoft YaHei"/>
                 <w:sz w:val="17"/>
               </w:rPr>
               <w:t>5</w:t>
@@ -6246,6 +6819,7 @@
             </w:pPr>
             <w:r>
               <w:rPr>
+                <w:rFonts w:ascii="Arial" w:hAnsi="Arial" w:cs="Arial" w:eastAsia="Microsoft YaHei"/>
                 <w:sz w:val="17"/>
               </w:rPr>
               <w:t>序号跳变</w:t>
@@ -6278,6 +6852,7 @@
             </w:pPr>
             <w:r>
               <w:rPr>
+                <w:rFonts w:ascii="Arial" w:hAnsi="Arial" w:cs="Arial" w:eastAsia="Microsoft YaHei"/>
                 <w:sz w:val="17"/>
               </w:rPr>
               <w:t>接收方NAK且expected_seq保持不变</w:t>
@@ -6316,6 +6891,7 @@
             </w:pPr>
             <w:r>
               <w:rPr>
+                <w:rFonts w:ascii="Arial" w:hAnsi="Arial" w:cs="Arial" w:eastAsia="Microsoft YaHei"/>
                 <w:sz w:val="17"/>
               </w:rPr>
               <w:t>6</w:t>
@@ -6349,6 +6925,7 @@
             </w:pPr>
             <w:r>
               <w:rPr>
+                <w:rFonts w:ascii="Arial" w:hAnsi="Arial" w:cs="Arial" w:eastAsia="Microsoft YaHei"/>
                 <w:sz w:val="17"/>
               </w:rPr>
               <w:t>EOT ACK丢失</w:t>
@@ -6382,6 +6959,7 @@
             </w:pPr>
             <w:r>
               <w:rPr>
+                <w:rFonts w:ascii="Arial" w:hAnsi="Arial" w:cs="Arial" w:eastAsia="Microsoft YaHei"/>
                 <w:sz w:val="17"/>
               </w:rPr>
               <w:t>发送方重发EOT，接收方再次ACK</w:t>
@@ -6419,6 +6997,7 @@
             </w:pPr>
             <w:r>
               <w:rPr>
+                <w:rFonts w:ascii="Arial" w:hAnsi="Arial" w:cs="Arial" w:eastAsia="Microsoft YaHei"/>
                 <w:sz w:val="17"/>
               </w:rPr>
               <w:t>7</w:t>
@@ -6451,6 +7030,7 @@
             </w:pPr>
             <w:r>
               <w:rPr>
+                <w:rFonts w:ascii="Arial" w:hAnsi="Arial" w:cs="Arial" w:eastAsia="Microsoft YaHei"/>
                 <w:sz w:val="17"/>
               </w:rPr>
               <w:t>非128倍数文件</w:t>
@@ -6483,6 +7063,7 @@
             </w:pPr>
             <w:r>
               <w:rPr>
+                <w:rFonts w:ascii="Arial" w:hAnsi="Arial" w:cs="Arial" w:eastAsia="Microsoft YaHei"/>
                 <w:sz w:val="17"/>
               </w:rPr>
               <w:t>发送前拒绝并明确报告错误</w:t>
@@ -6521,6 +7102,7 @@
             </w:pPr>
             <w:r>
               <w:rPr>
+                <w:rFonts w:ascii="Arial" w:hAnsi="Arial" w:cs="Arial" w:eastAsia="Microsoft YaHei"/>
                 <w:sz w:val="17"/>
               </w:rPr>
               <w:t>8</w:t>
@@ -6554,6 +7136,7 @@
             </w:pPr>
             <w:r>
               <w:rPr>
+                <w:rFonts w:ascii="Arial" w:hAnsi="Arial" w:cs="Arial" w:eastAsia="Microsoft YaHei"/>
                 <w:sz w:val="17"/>
               </w:rPr>
               <w:t>双向测试</w:t>
@@ -6587,6 +7170,7 @@
             </w:pPr>
             <w:r>
               <w:rPr>
+                <w:rFonts w:ascii="Arial" w:hAnsi="Arial" w:cs="Arial" w:eastAsia="Microsoft YaHei"/>
                 <w:sz w:val="17"/>
               </w:rPr>
               <w:t>上下位机互换发送与接收角色均成功</w:t>
@@ -6624,6 +7208,7 @@
             </w:pPr>
             <w:r>
               <w:rPr>
+                <w:rFonts w:ascii="Arial" w:hAnsi="Arial" w:cs="Arial" w:eastAsia="Microsoft YaHei"/>
                 <w:sz w:val="17"/>
               </w:rPr>
               <w:t>9</w:t>
@@ -6656,6 +7241,7 @@
             </w:pPr>
             <w:r>
               <w:rPr>
+                <w:rFonts w:ascii="Arial" w:hAnsi="Arial" w:cs="Arial" w:eastAsia="Microsoft YaHei"/>
                 <w:sz w:val="17"/>
               </w:rPr>
               <w:t>持续断链</w:t>
@@ -6688,6 +7274,7 @@
             </w:pPr>
             <w:r>
               <w:rPr>
+                <w:rFonts w:ascii="Arial" w:hAnsi="Arial" w:cs="Arial" w:eastAsia="Microsoft YaHei"/>
                 <w:sz w:val="17"/>
               </w:rPr>
               <w:t>超过60次重试后结束并报告失败</w:t>
@@ -6703,6 +7290,7 @@
     </w:p>
     <w:sectPr>
       <w:footerReference w:type="default" r:id="rId12"/>
+      <w:headerReference w:type="default" r:id="rId13"/>
       <w:pgSz w:w="12240" w:h="15840"/>
       <w:pgMar w:top="1037" w:right="1123" w:bottom="979" w:left="1123" w:header="720" w:footer="720" w:gutter="0"/>
       <w:cols w:space="720"/>
@@ -6721,6 +7309,7 @@
     </w:pPr>
     <w:r>
       <w:rPr>
+        <w:rFonts w:ascii="Arial" w:hAnsi="Arial" w:cs="Arial" w:eastAsia="Microsoft YaHei"/>
         <w:color w:val="646464"/>
         <w:sz w:val="16"/>
       </w:rPr>
@@ -6728,6 +7317,16 @@
     </w:r>
   </w:p>
 </w:ftr>
+</file>
+
+<file path=word/header1.xml><?xml version="1.0" encoding="utf-8"?>
+<w:hdr xmlns:m="http://schemas.openxmlformats.org/officeDocument/2006/math" xmlns:mc="http://schemas.openxmlformats.org/markup-compatibility/2006" xmlns:mo="http://schemas.microsoft.com/office/mac/office/2008/main" xmlns:mv="urn:schemas-microsoft-com:mac:vml" xmlns:o="urn:schemas-microsoft-com:office:office" xmlns:r="http://schemas.openxmlformats.org/officeDocument/2006/relationships" xmlns:v="urn:schemas-microsoft-com:vml" xmlns:w10="urn:schemas-microsoft-com:office:word" xmlns:w14="http://schemas.microsoft.com/office/word/2010/wordml" xmlns:w="http://schemas.openxmlformats.org/wordprocessingml/2006/main" xmlns:wne="http://schemas.microsoft.com/office/word/2006/wordml" xmlns:wp14="http://schemas.microsoft.com/office/word/2010/wordprocessingDrawing" xmlns:wp="http://schemas.openxmlformats.org/drawingml/2006/wordprocessingDrawing" xmlns:wpc="http://schemas.microsoft.com/office/word/2010/wordprocessingCanvas" xmlns:wpg="http://schemas.microsoft.com/office/word/2010/wordprocessingGroup" xmlns:wpi="http://schemas.microsoft.com/office/word/2010/wordprocessingInk" xmlns:wps="http://schemas.microsoft.com/office/word/2010/wordprocessingShape" mc:Ignorable="w14 wp14">
+  <w:p>
+    <w:pPr>
+      <w:pStyle w:val="Header"/>
+    </w:pPr>
+  </w:p>
+</w:hdr>
 </file>
 
 <file path=word/numbering.xml><?xml version="1.0" encoding="utf-8"?>
@@ -7097,7 +7696,7 @@
       <w:spacing w:line="300" w:lineRule="auto" w:after="120"/>
     </w:pPr>
     <w:rPr>
-      <w:rFonts w:ascii="Noto Sans CJK SC" w:hAnsi="Noto Sans CJK SC" w:eastAsia="Noto Sans CJK SC"/>
+      <w:rFonts w:ascii="Arial" w:hAnsi="Arial" w:cs="Arial" w:eastAsia="Microsoft YaHei"/>
       <w:color w:val="000000"/>
       <w:sz w:val="21"/>
     </w:rPr>
@@ -7161,7 +7760,7 @@
       <w:outlineLvl w:val="0"/>
     </w:pPr>
     <w:rPr>
-      <w:rFonts w:asciiTheme="majorHAnsi" w:eastAsiaTheme="majorEastAsia" w:hAnsiTheme="majorHAnsi" w:cstheme="majorBidi" w:ascii="Noto Sans CJK SC" w:hAnsi="Noto Sans CJK SC" w:eastAsia="Noto Sans CJK SC"/>
+      <w:rFonts w:ascii="Arial" w:hAnsi="Arial" w:cs="Arial" w:eastAsia="Microsoft YaHei"/>
       <w:b/>
       <w:bCs/>
       <w:color w:val="000000"/>
@@ -7185,7 +7784,7 @@
       <w:outlineLvl w:val="1"/>
     </w:pPr>
     <w:rPr>
-      <w:rFonts w:asciiTheme="majorHAnsi" w:eastAsiaTheme="majorEastAsia" w:hAnsiTheme="majorHAnsi" w:cstheme="majorBidi" w:ascii="Noto Sans CJK SC" w:hAnsi="Noto Sans CJK SC" w:eastAsia="Noto Sans CJK SC"/>
+      <w:rFonts w:ascii="Arial" w:hAnsi="Arial" w:cs="Arial" w:eastAsia="Microsoft YaHei"/>
       <w:b/>
       <w:bCs/>
       <w:color w:val="000000"/>
@@ -7209,7 +7808,7 @@
       <w:outlineLvl w:val="2"/>
     </w:pPr>
     <w:rPr>
-      <w:rFonts w:asciiTheme="majorHAnsi" w:eastAsiaTheme="majorEastAsia" w:hAnsiTheme="majorHAnsi" w:cstheme="majorBidi" w:ascii="Noto Sans CJK SC" w:hAnsi="Noto Sans CJK SC" w:eastAsia="Noto Sans CJK SC"/>
+      <w:rFonts w:ascii="Arial" w:hAnsi="Arial" w:cs="Arial" w:eastAsia="Microsoft YaHei"/>
       <w:b/>
       <w:bCs/>
       <w:color w:val="000000"/>
@@ -7448,7 +8047,7 @@
       <w:contextualSpacing/>
     </w:pPr>
     <w:rPr>
-      <w:rFonts w:asciiTheme="majorHAnsi" w:eastAsiaTheme="majorEastAsia" w:hAnsiTheme="majorHAnsi" w:cstheme="majorBidi" w:ascii="Noto Sans CJK SC" w:hAnsi="Noto Sans CJK SC" w:eastAsia="Noto Sans CJK SC"/>
+      <w:rFonts w:ascii="Arial" w:hAnsi="Arial" w:cs="Arial" w:eastAsia="Microsoft YaHei"/>
       <w:b/>
       <w:color w:val="000000"/>
       <w:spacing w:val="5"/>

</xml_diff>